<commit_message>
resume: replace unsupported claims with verified work
</commit_message>
<xml_diff>
--- a/resume.docx
+++ b/resume.docx
@@ -28,7 +28,7 @@
           <w:i w:val="0"/>
           <w:sz w:val="19"/>
         </w:rPr>
-        <w:t>(614) 290-4260  |  kkras5050@gmail.com  |  github.com/t4thick  |  linkedin.com/in/richard-effah-yeboah  |  Portfolio</w:t>
+        <w:t>(614) 290-4260  |  kkras5050@gmail.com  |  github.com/t4thick  |  linkedin.com/in/richyeff</w:t>
       </w:r>
     </w:p>
     <w:p>
@@ -90,7 +90,7 @@
           <w:i/>
           <w:sz w:val="20"/>
         </w:rPr>
-        <w:t>B.S. Computer Science (Sophomore)  |  GPA: 4.0/4.0</w:t>
+        <w:t>Bachelor of Science in Computer Science  |  GPA: 4.0/4.0</w:t>
       </w:r>
       <w:r>
         <w:tab/>
@@ -102,7 +102,7 @@
           <w:i/>
           <w:sz w:val="20"/>
         </w:rPr>
-        <w:t>Ruston, Louisiana</w:t>
+        <w:t>Grambling, Louisiana</w:t>
       </w:r>
     </w:p>
     <w:p>
@@ -125,30 +125,7 @@
           <w:i w:val="0"/>
           <w:sz w:val="19"/>
         </w:rPr>
-        <w:t>President's List; CodePath &amp; IBM Alumnus</w:t>
-      </w:r>
-    </w:p>
-    <w:p>
-      <w:pPr>
-        <w:spacing w:before="20" w:after="0"/>
-      </w:pPr>
-      <w:r>
-        <w:rPr>
-          <w:rFonts w:ascii="Garamond" w:hAnsi="Garamond"/>
-          <w:b/>
-          <w:i w:val="0"/>
-          <w:sz w:val="19"/>
-        </w:rPr>
-        <w:t xml:space="preserve">Relevant Coursework: </w:t>
-      </w:r>
-      <w:r>
-        <w:rPr>
-          <w:rFonts w:ascii="Garamond" w:hAnsi="Garamond"/>
-          <w:b w:val="0"/>
-          <w:i w:val="0"/>
-          <w:sz w:val="19"/>
-        </w:rPr>
-        <w:t>Data Structures, Algorithms, Software Engineering, Web Development, Database Systems, Cybersecurity</w:t>
+        <w:t>President's List</w:t>
       </w:r>
     </w:p>
     <w:p>
@@ -181,7 +158,7 @@
           <w:i w:val="0"/>
           <w:sz w:val="20"/>
         </w:rPr>
-        <w:t>Lovely Queen Mart</w:t>
+        <w:t>Kintampo African Market  |  kintampoafricanmarket.com</w:t>
       </w:r>
       <w:r>
         <w:tab/>
@@ -193,7 +170,7 @@
           <w:i w:val="0"/>
           <w:sz w:val="20"/>
         </w:rPr>
-        <w:t>Jan 2025 – Present</w:t>
+        <w:t>Mar 2026 – Present</w:t>
       </w:r>
     </w:p>
     <w:p>
@@ -210,7 +187,7 @@
           <w:i/>
           <w:sz w:val="20"/>
         </w:rPr>
-        <w:t>E-Commerce Developer</w:t>
+        <w:t>Freelance Full-Stack Developer</w:t>
       </w:r>
       <w:r>
         <w:tab/>
@@ -222,7 +199,7 @@
           <w:i/>
           <w:sz w:val="20"/>
         </w:rPr>
-        <w:t>Remote</w:t>
+        <w:t>Columbus, Ohio</w:t>
       </w:r>
     </w:p>
     <w:p>
@@ -236,7 +213,7 @@
           <w:rFonts w:ascii="Garamond" w:hAnsi="Garamond"/>
           <w:sz w:val="19"/>
         </w:rPr>
-        <w:t>Built a full-stack e-commerce platform (React, Node.js, PostgreSQL) managing 100+ SKUs with secure payment integration and order-fulfillment workflows</w:t>
+        <w:t>Rebuilt and deployed a Next.js storefront for 150+ African and Caribbean products with customer accounts, Stripe checkout, local pickup, and nationwide shipping</w:t>
       </w:r>
     </w:p>
     <w:p>
@@ -250,65 +227,7 @@
           <w:rFonts w:ascii="Garamond" w:hAnsi="Garamond"/>
           <w:sz w:val="19"/>
         </w:rPr>
-        <w:t>Redesigned ordering flow and site UX, improving customer retention by ~20% and engagement across the platform</w:t>
-      </w:r>
-    </w:p>
-    <w:p>
-      <w:pPr>
-        <w:tabs>
-          <w:tab w:pos="9360" w:val="right"/>
-        </w:tabs>
-        <w:spacing w:before="60" w:after="0"/>
-      </w:pPr>
-      <w:r>
-        <w:rPr>
-          <w:rFonts w:ascii="Garamond" w:hAnsi="Garamond"/>
-          <w:b/>
-          <w:i w:val="0"/>
-          <w:sz w:val="20"/>
-        </w:rPr>
-        <w:t>New Life International School</w:t>
-      </w:r>
-      <w:r>
-        <w:tab/>
-      </w:r>
-      <w:r>
-        <w:rPr>
-          <w:rFonts w:ascii="Garamond" w:hAnsi="Garamond"/>
-          <w:b w:val="0"/>
-          <w:i w:val="0"/>
-          <w:sz w:val="20"/>
-        </w:rPr>
-        <w:t>Jan 2024 – Dec 2024</w:t>
-      </w:r>
-    </w:p>
-    <w:p>
-      <w:pPr>
-        <w:tabs>
-          <w:tab w:pos="9360" w:val="right"/>
-        </w:tabs>
-        <w:spacing w:before="0" w:after="0"/>
-      </w:pPr>
-      <w:r>
-        <w:rPr>
-          <w:rFonts w:ascii="Garamond" w:hAnsi="Garamond"/>
-          <w:b w:val="0"/>
-          <w:i/>
-          <w:sz w:val="20"/>
-        </w:rPr>
-        <w:t>ICT Instructor &amp; Data Administrator</w:t>
-      </w:r>
-      <w:r>
-        <w:tab/>
-      </w:r>
-      <w:r>
-        <w:rPr>
-          <w:rFonts w:ascii="Garamond" w:hAnsi="Garamond"/>
-          <w:b w:val="0"/>
-          <w:i/>
-          <w:sz w:val="20"/>
-        </w:rPr>
-        <w:t>Kronum, Kumasi, Ghana</w:t>
+        <w:t>Implemented server-authoritative price validation, Stripe webhooks, unique payment records, refunds, and order-fulfillment workflows with TypeScript, Supabase, and PostgreSQL</w:t>
       </w:r>
     </w:p>
     <w:p>
@@ -322,93 +241,7 @@
           <w:rFonts w:ascii="Garamond" w:hAnsi="Garamond"/>
           <w:sz w:val="19"/>
         </w:rPr>
-        <w:t>Designed and delivered ICT curriculum with hands-on labs (Excel, productivity tools), improving student proficiency in core computing concepts</w:t>
-      </w:r>
-    </w:p>
-    <w:p>
-      <w:pPr>
-        <w:pStyle w:val="ListBullet"/>
-        <w:spacing w:before="0" w:after="20"/>
-        <w:ind w:left="360" w:hanging="216"/>
-      </w:pPr>
-      <w:r>
-        <w:rPr>
-          <w:rFonts w:ascii="Garamond" w:hAnsi="Garamond"/>
-          <w:sz w:val="19"/>
-        </w:rPr>
-        <w:t>Managed and validated student records in Excel, streamlining data accuracy and retrieval for administration workflows</w:t>
-      </w:r>
-    </w:p>
-    <w:p>
-      <w:pPr>
-        <w:tabs>
-          <w:tab w:pos="9360" w:val="right"/>
-        </w:tabs>
-        <w:spacing w:before="60" w:after="0"/>
-      </w:pPr>
-      <w:r>
-        <w:rPr>
-          <w:rFonts w:ascii="Garamond" w:hAnsi="Garamond"/>
-          <w:b/>
-          <w:i w:val="0"/>
-          <w:sz w:val="20"/>
-        </w:rPr>
-        <w:t>God First Printing Press</w:t>
-      </w:r>
-      <w:r>
-        <w:tab/>
-      </w:r>
-      <w:r>
-        <w:rPr>
-          <w:rFonts w:ascii="Garamond" w:hAnsi="Garamond"/>
-          <w:b w:val="0"/>
-          <w:i w:val="0"/>
-          <w:sz w:val="20"/>
-        </w:rPr>
-        <w:t>May 2024 – Nov 2024</w:t>
-      </w:r>
-    </w:p>
-    <w:p>
-      <w:pPr>
-        <w:tabs>
-          <w:tab w:pos="9360" w:val="right"/>
-        </w:tabs>
-        <w:spacing w:before="0" w:after="0"/>
-      </w:pPr>
-      <w:r>
-        <w:rPr>
-          <w:rFonts w:ascii="Garamond" w:hAnsi="Garamond"/>
-          <w:b w:val="0"/>
-          <w:i/>
-          <w:sz w:val="20"/>
-        </w:rPr>
-        <w:t>Graphic Designer</w:t>
-      </w:r>
-      <w:r>
-        <w:tab/>
-      </w:r>
-      <w:r>
-        <w:rPr>
-          <w:rFonts w:ascii="Garamond" w:hAnsi="Garamond"/>
-          <w:b w:val="0"/>
-          <w:i/>
-          <w:sz w:val="20"/>
-        </w:rPr>
-        <w:t>Kumasi, Ghana (Part-Time)</w:t>
-      </w:r>
-    </w:p>
-    <w:p>
-      <w:pPr>
-        <w:pStyle w:val="ListBullet"/>
-        <w:spacing w:before="0" w:after="20"/>
-        <w:ind w:left="360" w:hanging="216"/>
-      </w:pPr>
-      <w:r>
-        <w:rPr>
-          <w:rFonts w:ascii="Garamond" w:hAnsi="Garamond"/>
-          <w:sz w:val="19"/>
-        </w:rPr>
-        <w:t>Produced print and digital marketing assets (flyers, banners, logos) in Photoshop; delivered on deadline with consistent brand quality</w:t>
+        <w:t>Built staff tools for catalog, inventory, customer, and shipping operations; maintain 61 Playwright tests across 13 files covering checkout, tax, refunds, receipts, navigation, and administrative APIs</w:t>
       </w:r>
     </w:p>
     <w:p>
@@ -441,7 +274,7 @@
           <w:i w:val="0"/>
           <w:sz w:val="20"/>
         </w:rPr>
-        <w:t>Item7 Food Truck Ordering System</w:t>
+        <w:t>Prince Auto Inventory &amp; POS System</w:t>
       </w:r>
       <w:r>
         <w:tab/>
@@ -453,7 +286,7 @@
           <w:i w:val="0"/>
           <w:sz w:val="20"/>
         </w:rPr>
-        <w:t>Jan 2025 – Apr 2025</w:t>
+        <w:t>Aug 2026 – Present</w:t>
       </w:r>
     </w:p>
     <w:p>
@@ -467,7 +300,7 @@
           <w:i/>
           <w:sz w:val="19"/>
         </w:rPr>
-        <w:t>Python, Flask, PostgreSQL, SQLAlchemy, REST API, Redis, Vercel, Stripe  |  Live Demo  |  GitHub</w:t>
+        <w:t>React, TypeScript, Supabase, PostgreSQL, PWA  |  prince-inventory-manager.vercel.app  |  github.com/t4thick/prince-inventory-manager</w:t>
       </w:r>
     </w:p>
     <w:p>
@@ -481,7 +314,7 @@
           <w:rFonts w:ascii="Garamond" w:hAnsi="Garamond"/>
           <w:sz w:val="19"/>
         </w:rPr>
-        <w:t>Engineered a full-stack ordering platform (Python, Flask, PostgreSQL, SQLAlchemy) with a relational data model for 50+ menu items, carts, and orders; implemented CRUD flows and server-side validation via RESTful endpoints</w:t>
+        <w:t>Built a role-based inventory and point-of-sale application for a mechanic shop with shared stock, parts and labor checkout, customer balances, printable receipts, and reports</w:t>
       </w:r>
     </w:p>
     <w:p>
@@ -495,7 +328,7 @@
           <w:rFonts w:ascii="Garamond" w:hAnsi="Garamond"/>
           <w:sz w:val="19"/>
         </w:rPr>
-        <w:t>Built a role-based staff portal (4 roles) for order and operations management; integrated Stripe checkout with robust error handling and order state consistency</w:t>
+        <w:t>Implemented PostgreSQL functions that validate stock and atomically record sales, inventory changes, and financial snapshots; made offline retries idempotent to prevent duplicate sales</w:t>
       </w:r>
     </w:p>
     <w:p>
@@ -509,7 +342,7 @@
           <w:rFonts w:ascii="Garamond" w:hAnsi="Garamond"/>
           <w:sz w:val="19"/>
         </w:rPr>
-        <w:t>Implemented Redis caching and serverless deployment (Vercel) to improve API performance and scalability</w:t>
+        <w:t>Added an offline sales queue that syncs after reconnection and owner-controlled voids that restore stock while preserving an audit trail</w:t>
       </w:r>
     </w:p>
     <w:p>
@@ -526,7 +359,7 @@
           <w:i w:val="0"/>
           <w:sz w:val="20"/>
         </w:rPr>
-        <w:t>DevCanvas (Portfolio Site)</w:t>
+        <w:t>Item7 Food Truck Management System</w:t>
       </w:r>
       <w:r>
         <w:tab/>
@@ -538,7 +371,7 @@
           <w:i w:val="0"/>
           <w:sz w:val="20"/>
         </w:rPr>
-        <w:t>Side Project</w:t>
+        <w:t>Jan 2026</w:t>
       </w:r>
     </w:p>
     <w:p>
@@ -552,7 +385,7 @@
           <w:i/>
           <w:sz w:val="19"/>
         </w:rPr>
-        <w:t>Next.js, TypeScript, Tailwind CSS  |  GitHub</w:t>
+        <w:t>Python, Flask, PostgreSQL, SQLAlchemy  |  foodtruckk.vercel.app  |  github.com/t4thick/project-foodtruck</w:t>
       </w:r>
     </w:p>
     <w:p>
@@ -566,7 +399,7 @@
           <w:rFonts w:ascii="Garamond" w:hAnsi="Garamond"/>
           <w:sz w:val="19"/>
         </w:rPr>
-        <w:t>Developed a responsive portfolio (Next.js, TypeScript, Tailwind CSS) with component-driven architecture to showcase projects and experience in a recruiter-scannable format</w:t>
+        <w:t>Developed a responsive ordering and operations application with customer checkout, real-time order tracking, staff scheduling, shift tracking, and role-based management tools</w:t>
       </w:r>
     </w:p>
     <w:p>
@@ -580,7 +413,7 @@
           <w:rFonts w:ascii="Garamond" w:hAnsi="Garamond"/>
           <w:sz w:val="19"/>
         </w:rPr>
-        <w:t>Optimized page structure for SEO and fast navigation; maintained content through reusable sections and consistent formatting</w:t>
+        <w:t>Modeled users, menu items, orders, schedules, and shifts in PostgreSQL with SQLAlchemy; added CSRF protection, rate limiting, password hashing, and input validation</w:t>
       </w:r>
     </w:p>
     <w:p>
@@ -619,7 +452,7 @@
           <w:i w:val="0"/>
           <w:sz w:val="19"/>
         </w:rPr>
-        <w:t>Python, TypeScript, JavaScript, SQL, HTML/CSS</w:t>
+        <w:t>TypeScript, JavaScript, Python, Java, SQL, HTML/CSS</w:t>
       </w:r>
     </w:p>
     <w:p>
@@ -633,7 +466,7 @@
           <w:i w:val="0"/>
           <w:sz w:val="19"/>
         </w:rPr>
-        <w:t xml:space="preserve">Technologies/Frameworks: </w:t>
+        <w:t xml:space="preserve">Frameworks &amp; Runtimes: </w:t>
       </w:r>
       <w:r>
         <w:rPr>
@@ -642,7 +475,7 @@
           <w:i w:val="0"/>
           <w:sz w:val="19"/>
         </w:rPr>
-        <w:t>React, Next.js, Flask, Node.js, REST APIs, SQLAlchemy, PostgreSQL, Redis</w:t>
+        <w:t>Next.js, React, Flask, Node.js, Tailwind CSS</w:t>
       </w:r>
     </w:p>
     <w:p>
@@ -656,7 +489,7 @@
           <w:i w:val="0"/>
           <w:sz w:val="19"/>
         </w:rPr>
-        <w:t xml:space="preserve">Tools: </w:t>
+        <w:t xml:space="preserve">Data &amp; Services: </w:t>
       </w:r>
       <w:r>
         <w:rPr>
@@ -665,7 +498,7 @@
           <w:i w:val="0"/>
           <w:sz w:val="19"/>
         </w:rPr>
-        <w:t>Git/GitHub, Vercel, Stripe API, Excel</w:t>
+        <w:t>PostgreSQL, Supabase, Redis, SQLAlchemy, Stripe</w:t>
       </w:r>
     </w:p>
     <w:p>
@@ -679,7 +512,7 @@
           <w:i w:val="0"/>
           <w:sz w:val="19"/>
         </w:rPr>
-        <w:t xml:space="preserve">Concepts: </w:t>
+        <w:t xml:space="preserve">Testing &amp; Tools: </w:t>
       </w:r>
       <w:r>
         <w:rPr>
@@ -688,172 +521,12 @@
           <w:i w:val="0"/>
           <w:sz w:val="19"/>
         </w:rPr>
-        <w:t>Full-Stack Development, RESTful APIs, Relational Databases, Role-Based Access Control</w:t>
+        <w:t>Playwright, Vitest, Git, GitHub Actions, Vercel</w:t>
       </w:r>
     </w:p>
     <w:p>
       <w:pPr>
-        <w:spacing w:before="120" w:after="20"/>
-        <w:pBdr>
-          <w:bottom w:val="single" w:sz="6" w:space="1" w:color="000000"/>
-        </w:pBdr>
-      </w:pPr>
-      <w:r>
-        <w:rPr>
-          <w:rFonts w:ascii="Garamond" w:hAnsi="Garamond"/>
-          <w:b/>
-          <w:sz w:val="22"/>
-        </w:rPr>
-        <w:t>ACTIVITIES / LEADERSHIP</w:t>
-      </w:r>
-    </w:p>
-    <w:p>
-      <w:pPr>
-        <w:tabs>
-          <w:tab w:pos="9360" w:val="right"/>
-        </w:tabs>
-        <w:spacing w:before="60" w:after="0"/>
-      </w:pPr>
-      <w:r>
-        <w:rPr>
-          <w:rFonts w:ascii="Garamond" w:hAnsi="Garamond"/>
-          <w:b/>
-          <w:i w:val="0"/>
-          <w:sz w:val="20"/>
-        </w:rPr>
-        <w:t>IBM SkillsBuild</w:t>
-      </w:r>
-      <w:r>
-        <w:tab/>
-      </w:r>
-      <w:r>
-        <w:rPr>
-          <w:rFonts w:ascii="Garamond" w:hAnsi="Garamond"/>
-          <w:b w:val="0"/>
-          <w:i w:val="0"/>
-          <w:sz w:val="20"/>
-        </w:rPr>
-        <w:t>May 2025 – Jun 2025</w:t>
-      </w:r>
-    </w:p>
-    <w:p>
-      <w:pPr>
-        <w:tabs>
-          <w:tab w:pos="9360" w:val="right"/>
-        </w:tabs>
-        <w:spacing w:before="0" w:after="0"/>
-      </w:pPr>
-      <w:r>
-        <w:rPr>
-          <w:rFonts w:ascii="Garamond" w:hAnsi="Garamond"/>
-          <w:b w:val="0"/>
-          <w:i/>
-          <w:sz w:val="20"/>
-        </w:rPr>
-        <w:t>IBM Scholar – Data Science Track</w:t>
-      </w:r>
-      <w:r>
-        <w:tab/>
-      </w:r>
-      <w:r>
-        <w:rPr>
-          <w:rFonts w:ascii="Garamond" w:hAnsi="Garamond"/>
-          <w:b w:val="0"/>
-          <w:i/>
-          <w:sz w:val="20"/>
-        </w:rPr>
-        <w:t>Virtual</w:t>
-      </w:r>
-    </w:p>
-    <w:p>
-      <w:pPr>
-        <w:pStyle w:val="ListBullet"/>
-        <w:spacing w:before="0" w:after="20"/>
-        <w:ind w:left="360" w:hanging="216"/>
-      </w:pPr>
-      <w:r>
-        <w:rPr>
-          <w:rFonts w:ascii="Garamond" w:hAnsi="Garamond"/>
-          <w:sz w:val="19"/>
-        </w:rPr>
-        <w:t>Completed end-to-end data workflows in Python (Jupyter Notebook, Watson Studio); applied data wrangling and statistical analysis across multiple datasets to derive actionable insights</w:t>
-      </w:r>
-    </w:p>
-    <w:p>
-      <w:pPr>
-        <w:tabs>
-          <w:tab w:pos="9360" w:val="right"/>
-        </w:tabs>
-        <w:spacing w:before="60" w:after="0"/>
-      </w:pPr>
-      <w:r>
-        <w:rPr>
-          <w:rFonts w:ascii="Garamond" w:hAnsi="Garamond"/>
-          <w:b/>
-          <w:i w:val="0"/>
-          <w:sz w:val="20"/>
-        </w:rPr>
-        <w:t>ColorStack</w:t>
-      </w:r>
-      <w:r>
-        <w:tab/>
-      </w:r>
-      <w:r>
-        <w:rPr>
-          <w:rFonts w:ascii="Garamond" w:hAnsi="Garamond"/>
-          <w:b w:val="0"/>
-          <w:i w:val="0"/>
-          <w:sz w:val="20"/>
-        </w:rPr>
-        <w:t>Sept 2024 – Present</w:t>
-      </w:r>
-    </w:p>
-    <w:p>
-      <w:pPr>
-        <w:tabs>
-          <w:tab w:pos="9360" w:val="right"/>
-        </w:tabs>
-        <w:spacing w:before="0" w:after="0"/>
-      </w:pPr>
-      <w:r>
-        <w:rPr>
-          <w:rFonts w:ascii="Garamond" w:hAnsi="Garamond"/>
-          <w:b w:val="0"/>
-          <w:i/>
-          <w:sz w:val="20"/>
-        </w:rPr>
-        <w:t>Member</w:t>
-      </w:r>
-      <w:r>
-        <w:tab/>
-      </w:r>
-      <w:r>
-        <w:rPr>
-          <w:rFonts w:ascii="Garamond" w:hAnsi="Garamond"/>
-          <w:b w:val="0"/>
-          <w:i/>
-          <w:sz w:val="20"/>
-        </w:rPr>
-        <w:t>Grambling State University</w:t>
-      </w:r>
-    </w:p>
-    <w:p>
-      <w:pPr>
-        <w:pStyle w:val="ListBullet"/>
-        <w:spacing w:before="0" w:after="20"/>
-        <w:ind w:left="360" w:hanging="216"/>
-      </w:pPr>
-      <w:r>
-        <w:rPr>
-          <w:rFonts w:ascii="Garamond" w:hAnsi="Garamond"/>
-          <w:sz w:val="19"/>
-        </w:rPr>
-        <w:t>Active member in technical community; CodePath &amp; IBM Alumnus; certifications in Web Development, AI, Cybersecurity, Data, and IBM Enterprise Design Thinking</w:t>
-      </w:r>
-    </w:p>
-    <w:p>
-      <w:pPr>
-        <w:spacing w:before="60" w:after="0"/>
+        <w:spacing w:before="20" w:after="20"/>
       </w:pPr>
       <w:r>
         <w:rPr>
@@ -862,7 +535,7 @@
           <w:i w:val="0"/>
           <w:sz w:val="19"/>
         </w:rPr>
-        <w:t xml:space="preserve">Clubs: </w:t>
+        <w:t xml:space="preserve">Engineering: </w:t>
       </w:r>
       <w:r>
         <w:rPr>
@@ -871,7 +544,7 @@
           <w:i w:val="0"/>
           <w:sz w:val="19"/>
         </w:rPr>
-        <w:t>Advocacy for Climate Change Education  |  ISSUP  |  SECURE+  |  African Student Association</w:t>
+        <w:t>Full-Stack Development, REST APIs, Authentication, Relational Data Modeling</w:t>
       </w:r>
     </w:p>
     <w:sectPr>

</xml_diff>

<commit_message>
resume: update GitHub username
</commit_message>
<xml_diff>
--- a/resume.docx
+++ b/resume.docx
@@ -28,7 +28,7 @@
           <w:i w:val="0"/>
           <w:sz w:val="19"/>
         </w:rPr>
-        <w:t>(614) 290-4260  |  kkras5050@gmail.com  |  github.com/t4thick  |  linkedin.com/in/richyeff</w:t>
+        <w:t>(614) 290-4260  |  kkras5050@gmail.com  |  github.com/richardeyeboah  |  linkedin.com/in/richyeff</w:t>
       </w:r>
     </w:p>
     <w:p>
@@ -300,7 +300,7 @@
           <w:i/>
           <w:sz w:val="19"/>
         </w:rPr>
-        <w:t>React, TypeScript, Supabase, PostgreSQL, PWA  |  prince-inventory-manager.vercel.app  |  github.com/t4thick/prince-inventory-manager</w:t>
+        <w:t>React, TypeScript, Supabase, PostgreSQL, PWA  |  prince-inventory-manager.vercel.app  |  github.com/richardeyeboah/prince-inventory-manager</w:t>
       </w:r>
     </w:p>
     <w:p>
@@ -385,7 +385,7 @@
           <w:i/>
           <w:sz w:val="19"/>
         </w:rPr>
-        <w:t>Python, Flask, PostgreSQL, SQLAlchemy  |  foodtruckk.vercel.app  |  github.com/t4thick/project-foodtruck</w:t>
+        <w:t>Python, Flask, PostgreSQL, SQLAlchemy  |  foodtruckk.vercel.app  |  github.com/richardeyeboah/project-foodtruck</w:t>
       </w:r>
     </w:p>
     <w:p>

</xml_diff>